<commit_message>
update: Realizado a correção e alteração de alguns arquivos
</commit_message>
<xml_diff>
--- a/01-Modelo de Documentação de Sistema_2.docx
+++ b/01-Modelo de Documentação de Sistema_2.docx
@@ -115,8 +115,10 @@
                 <w:sz w:val="28"/>
                 <w:szCs w:val="28"/>
               </w:rPr>
-              <w:t>Bancário</w:t>
-            </w:r>
+              <w:t>de Receitas</w:t>
+            </w:r>
+            <w:bookmarkStart w:id="0" w:name="_GoBack"/>
+            <w:bookmarkEnd w:id="0"/>
           </w:p>
         </w:tc>
       </w:tr>
@@ -799,6 +801,7 @@
                   <w14:uncheckedState w14:val="2610" w14:font="MS Gothic"/>
                 </w14:checkbox>
               </w:sdtPr>
+              <w:sdtEndPr/>
               <w:sdtContent>
                 <w:r>
                   <w:rPr>
@@ -833,6 +836,7 @@
                   <w14:uncheckedState w14:val="2610" w14:font="MS Gothic"/>
                 </w14:checkbox>
               </w:sdtPr>
+              <w:sdtEndPr/>
               <w:sdtContent>
                 <w:r>
                   <w:rPr>
@@ -1711,6 +1715,7 @@
                   <w14:uncheckedState w14:val="2610" w14:font="MS Gothic"/>
                 </w14:checkbox>
               </w:sdtPr>
+              <w:sdtEndPr/>
               <w:sdtContent>
                 <w:r>
                   <w:rPr>
@@ -1764,6 +1769,7 @@
                   <w14:uncheckedState w14:val="2610" w14:font="MS Gothic"/>
                 </w14:checkbox>
               </w:sdtPr>
+              <w:sdtEndPr/>
               <w:sdtContent>
                 <w:r>
                   <w:rPr>
@@ -3797,6 +3803,7 @@
                 <w14:uncheckedState w14:val="2610" w14:font="MS Gothic"/>
               </w14:checkbox>
             </w:sdtPr>
+            <w:sdtEndPr/>
             <w:sdtContent>
               <w:p>
                 <w:pPr>
@@ -3833,6 +3840,7 @@
                 <w14:uncheckedState w14:val="2610" w14:font="MS Gothic"/>
               </w14:checkbox>
             </w:sdtPr>
+            <w:sdtEndPr/>
             <w:sdtContent>
               <w:p>
                 <w:pPr>
@@ -3869,6 +3877,7 @@
                 <w14:uncheckedState w14:val="2610" w14:font="MS Gothic"/>
               </w14:checkbox>
             </w:sdtPr>
+            <w:sdtEndPr/>
             <w:sdtContent>
               <w:p>
                 <w:pPr>
@@ -3975,6 +3984,7 @@
                 <w14:uncheckedState w14:val="2610" w14:font="MS Gothic"/>
               </w14:checkbox>
             </w:sdtPr>
+            <w:sdtEndPr/>
             <w:sdtContent>
               <w:p>
                 <w:pPr>
@@ -4011,6 +4021,7 @@
                 <w14:uncheckedState w14:val="2610" w14:font="MS Gothic"/>
               </w14:checkbox>
             </w:sdtPr>
+            <w:sdtEndPr/>
             <w:sdtContent>
               <w:p>
                 <w:pPr>
@@ -5009,6 +5020,7 @@
               <w:listItem w:displayText="Usabilidade" w:value="Usabilidade"/>
             </w:comboBox>
           </w:sdtPr>
+          <w:sdtEndPr/>
           <w:sdtContent>
             <w:tc>
               <w:tcPr>
@@ -5053,6 +5065,7 @@
               <w:listItem w:displayText="Desejável" w:value="Desejável"/>
             </w:comboBox>
           </w:sdtPr>
+          <w:sdtEndPr/>
           <w:sdtContent>
             <w:tc>
               <w:tcPr>
@@ -5172,6 +5185,7 @@
               <w:listItem w:displayText="Usabilidade" w:value="Usabilidade"/>
             </w:comboBox>
           </w:sdtPr>
+          <w:sdtEndPr/>
           <w:sdtContent>
             <w:tc>
               <w:tcPr>
@@ -5216,6 +5230,7 @@
               <w:listItem w:displayText="Desejável" w:value="Desejável"/>
             </w:comboBox>
           </w:sdtPr>
+          <w:sdtEndPr/>
           <w:sdtContent>
             <w:tc>
               <w:tcPr>
@@ -5335,6 +5350,7 @@
               <w:listItem w:displayText="Usabilidade" w:value="Usabilidade"/>
             </w:comboBox>
           </w:sdtPr>
+          <w:sdtEndPr/>
           <w:sdtContent>
             <w:tc>
               <w:tcPr>
@@ -5379,6 +5395,7 @@
               <w:listItem w:displayText="Desejável" w:value="Desejável"/>
             </w:comboBox>
           </w:sdtPr>
+          <w:sdtEndPr/>
           <w:sdtContent>
             <w:tc>
               <w:tcPr>
@@ -5488,6 +5505,7 @@
               <w:listItem w:displayText="Usabilidade" w:value="Usabilidade"/>
             </w:comboBox>
           </w:sdtPr>
+          <w:sdtEndPr/>
           <w:sdtContent>
             <w:tc>
               <w:tcPr>
@@ -5532,6 +5550,7 @@
               <w:listItem w:displayText="Desejável" w:value="Desejável"/>
             </w:comboBox>
           </w:sdtPr>
+          <w:sdtEndPr/>
           <w:sdtContent>
             <w:tc>
               <w:tcPr>
@@ -5641,6 +5660,7 @@
               <w:listItem w:displayText="Usabilidade" w:value="Usabilidade"/>
             </w:comboBox>
           </w:sdtPr>
+          <w:sdtEndPr/>
           <w:sdtContent>
             <w:tc>
               <w:tcPr>
@@ -5686,6 +5706,7 @@
               <w:listItem w:displayText="Desejável" w:value="Desejável"/>
             </w:comboBox>
           </w:sdtPr>
+          <w:sdtEndPr/>
           <w:sdtContent>
             <w:tc>
               <w:tcPr>
@@ -6123,6 +6144,7 @@
               <w:listItem w:displayText="Usabilidade" w:value="Usabilidade"/>
             </w:comboBox>
           </w:sdtPr>
+          <w:sdtEndPr/>
           <w:sdtContent>
             <w:tc>
               <w:tcPr>
@@ -6168,6 +6190,7 @@
               <w:listItem w:displayText="Desejável" w:value="Desejável"/>
             </w:comboBox>
           </w:sdtPr>
+          <w:sdtEndPr/>
           <w:sdtContent>
             <w:tc>
               <w:tcPr>
@@ -6281,6 +6304,7 @@
               <w:listItem w:displayText="Usabilidade" w:value="Usabilidade"/>
             </w:comboBox>
           </w:sdtPr>
+          <w:sdtEndPr/>
           <w:sdtContent>
             <w:tc>
               <w:tcPr>
@@ -6326,6 +6350,7 @@
               <w:listItem w:displayText="Desejável" w:value="Desejável"/>
             </w:comboBox>
           </w:sdtPr>
+          <w:sdtEndPr/>
           <w:sdtContent>
             <w:tc>
               <w:tcPr>
@@ -6439,6 +6464,7 @@
               <w:listItem w:displayText="Usabilidade" w:value="Usabilidade"/>
             </w:comboBox>
           </w:sdtPr>
+          <w:sdtEndPr/>
           <w:sdtContent>
             <w:tc>
               <w:tcPr>
@@ -6484,6 +6510,7 @@
               <w:listItem w:displayText="Desejável" w:value="Desejável"/>
             </w:comboBox>
           </w:sdtPr>
+          <w:sdtEndPr/>
           <w:sdtContent>
             <w:tc>
               <w:tcPr>
@@ -6595,6 +6622,7 @@
               <w:listItem w:displayText="Usabilidade" w:value="Usabilidade"/>
             </w:comboBox>
           </w:sdtPr>
+          <w:sdtEndPr/>
           <w:sdtContent>
             <w:tc>
               <w:tcPr>
@@ -6642,6 +6670,7 @@
               <w:listItem w:displayText="Desejável" w:value="Desejável"/>
             </w:comboBox>
           </w:sdtPr>
+          <w:sdtEndPr/>
           <w:sdtContent>
             <w:tc>
               <w:tcPr>
@@ -6754,6 +6783,7 @@
               <w:listItem w:displayText="Usabilidade" w:value="Usabilidade"/>
             </w:comboBox>
           </w:sdtPr>
+          <w:sdtEndPr/>
           <w:sdtContent>
             <w:tc>
               <w:tcPr>
@@ -6801,6 +6831,7 @@
               <w:listItem w:displayText="Desejável" w:value="Desejável"/>
             </w:comboBox>
           </w:sdtPr>
+          <w:sdtEndPr/>
           <w:sdtContent>
             <w:tc>
               <w:tcPr>
@@ -7256,6 +7287,7 @@
               <w:listItem w:displayText="Usabilidade" w:value="Usabilidade"/>
             </w:comboBox>
           </w:sdtPr>
+          <w:sdtEndPr/>
           <w:sdtContent>
             <w:tc>
               <w:tcPr>
@@ -7301,6 +7333,7 @@
               <w:listItem w:displayText="Desejável" w:value="Desejável"/>
             </w:comboBox>
           </w:sdtPr>
+          <w:sdtEndPr/>
           <w:sdtContent>
             <w:tc>
               <w:tcPr>
@@ -7414,6 +7447,7 @@
               <w:listItem w:displayText="Usabilidade" w:value="Usabilidade"/>
             </w:comboBox>
           </w:sdtPr>
+          <w:sdtEndPr/>
           <w:sdtContent>
             <w:tc>
               <w:tcPr>
@@ -7459,6 +7493,7 @@
               <w:listItem w:displayText="Desejável" w:value="Desejável"/>
             </w:comboBox>
           </w:sdtPr>
+          <w:sdtEndPr/>
           <w:sdtContent>
             <w:tc>
               <w:tcPr>
@@ -7572,6 +7607,7 @@
               <w:listItem w:displayText="Usabilidade" w:value="Usabilidade"/>
             </w:comboBox>
           </w:sdtPr>
+          <w:sdtEndPr/>
           <w:sdtContent>
             <w:tc>
               <w:tcPr>
@@ -7617,6 +7653,7 @@
               <w:listItem w:displayText="Desejável" w:value="Desejável"/>
             </w:comboBox>
           </w:sdtPr>
+          <w:sdtEndPr/>
           <w:sdtContent>
             <w:tc>
               <w:tcPr>
@@ -7728,6 +7765,7 @@
               <w:listItem w:displayText="Usabilidade" w:value="Usabilidade"/>
             </w:comboBox>
           </w:sdtPr>
+          <w:sdtEndPr/>
           <w:sdtContent>
             <w:tc>
               <w:tcPr>
@@ -7775,6 +7813,7 @@
               <w:listItem w:displayText="Desejável" w:value="Desejável"/>
             </w:comboBox>
           </w:sdtPr>
+          <w:sdtEndPr/>
           <w:sdtContent>
             <w:tc>
               <w:tcPr>
@@ -7887,6 +7926,7 @@
               <w:listItem w:displayText="Usabilidade" w:value="Usabilidade"/>
             </w:comboBox>
           </w:sdtPr>
+          <w:sdtEndPr/>
           <w:sdtContent>
             <w:tc>
               <w:tcPr>
@@ -7934,6 +7974,7 @@
               <w:listItem w:displayText="Desejável" w:value="Desejável"/>
             </w:comboBox>
           </w:sdtPr>
+          <w:sdtEndPr/>
           <w:sdtContent>
             <w:tc>
               <w:tcPr>
@@ -8392,6 +8433,7 @@
               <w:listItem w:displayText="Usabilidade" w:value="Usabilidade"/>
             </w:comboBox>
           </w:sdtPr>
+          <w:sdtEndPr/>
           <w:sdtContent>
             <w:tc>
               <w:tcPr>
@@ -8437,6 +8479,7 @@
               <w:listItem w:displayText="Desejável" w:value="Desejável"/>
             </w:comboBox>
           </w:sdtPr>
+          <w:sdtEndPr/>
           <w:sdtContent>
             <w:tc>
               <w:tcPr>
@@ -8550,6 +8593,7 @@
               <w:listItem w:displayText="Usabilidade" w:value="Usabilidade"/>
             </w:comboBox>
           </w:sdtPr>
+          <w:sdtEndPr/>
           <w:sdtContent>
             <w:tc>
               <w:tcPr>
@@ -8595,6 +8639,7 @@
               <w:listItem w:displayText="Desejável" w:value="Desejável"/>
             </w:comboBox>
           </w:sdtPr>
+          <w:sdtEndPr/>
           <w:sdtContent>
             <w:tc>
               <w:tcPr>
@@ -8708,6 +8753,7 @@
               <w:listItem w:displayText="Usabilidade" w:value="Usabilidade"/>
             </w:comboBox>
           </w:sdtPr>
+          <w:sdtEndPr/>
           <w:sdtContent>
             <w:tc>
               <w:tcPr>
@@ -8753,6 +8799,7 @@
               <w:listItem w:displayText="Desejável" w:value="Desejável"/>
             </w:comboBox>
           </w:sdtPr>
+          <w:sdtEndPr/>
           <w:sdtContent>
             <w:tc>
               <w:tcPr>
@@ -8864,6 +8911,7 @@
               <w:listItem w:displayText="Usabilidade" w:value="Usabilidade"/>
             </w:comboBox>
           </w:sdtPr>
+          <w:sdtEndPr/>
           <w:sdtContent>
             <w:tc>
               <w:tcPr>
@@ -8911,6 +8959,7 @@
               <w:listItem w:displayText="Desejável" w:value="Desejável"/>
             </w:comboBox>
           </w:sdtPr>
+          <w:sdtEndPr/>
           <w:sdtContent>
             <w:tc>
               <w:tcPr>
@@ -9023,6 +9072,7 @@
               <w:listItem w:displayText="Usabilidade" w:value="Usabilidade"/>
             </w:comboBox>
           </w:sdtPr>
+          <w:sdtEndPr/>
           <w:sdtContent>
             <w:tc>
               <w:tcPr>
@@ -9070,6 +9120,7 @@
               <w:listItem w:displayText="Desejável" w:value="Desejável"/>
             </w:comboBox>
           </w:sdtPr>
+          <w:sdtEndPr/>
           <w:sdtContent>
             <w:tc>
               <w:tcPr>
@@ -9528,6 +9579,7 @@
               <w:listItem w:displayText="Usabilidade" w:value="Usabilidade"/>
             </w:comboBox>
           </w:sdtPr>
+          <w:sdtEndPr/>
           <w:sdtContent>
             <w:tc>
               <w:tcPr>
@@ -9573,6 +9625,7 @@
               <w:listItem w:displayText="Desejável" w:value="Desejável"/>
             </w:comboBox>
           </w:sdtPr>
+          <w:sdtEndPr/>
           <w:sdtContent>
             <w:tc>
               <w:tcPr>
@@ -9686,6 +9739,7 @@
               <w:listItem w:displayText="Usabilidade" w:value="Usabilidade"/>
             </w:comboBox>
           </w:sdtPr>
+          <w:sdtEndPr/>
           <w:sdtContent>
             <w:tc>
               <w:tcPr>
@@ -9731,6 +9785,7 @@
               <w:listItem w:displayText="Desejável" w:value="Desejável"/>
             </w:comboBox>
           </w:sdtPr>
+          <w:sdtEndPr/>
           <w:sdtContent>
             <w:tc>
               <w:tcPr>
@@ -9844,6 +9899,7 @@
               <w:listItem w:displayText="Usabilidade" w:value="Usabilidade"/>
             </w:comboBox>
           </w:sdtPr>
+          <w:sdtEndPr/>
           <w:sdtContent>
             <w:tc>
               <w:tcPr>
@@ -9889,6 +9945,7 @@
               <w:listItem w:displayText="Desejável" w:value="Desejável"/>
             </w:comboBox>
           </w:sdtPr>
+          <w:sdtEndPr/>
           <w:sdtContent>
             <w:tc>
               <w:tcPr>
@@ -10000,6 +10057,7 @@
               <w:listItem w:displayText="Usabilidade" w:value="Usabilidade"/>
             </w:comboBox>
           </w:sdtPr>
+          <w:sdtEndPr/>
           <w:sdtContent>
             <w:tc>
               <w:tcPr>
@@ -10047,6 +10105,7 @@
               <w:listItem w:displayText="Desejável" w:value="Desejável"/>
             </w:comboBox>
           </w:sdtPr>
+          <w:sdtEndPr/>
           <w:sdtContent>
             <w:tc>
               <w:tcPr>
@@ -10159,6 +10218,7 @@
               <w:listItem w:displayText="Usabilidade" w:value="Usabilidade"/>
             </w:comboBox>
           </w:sdtPr>
+          <w:sdtEndPr/>
           <w:sdtContent>
             <w:tc>
               <w:tcPr>
@@ -10206,6 +10266,7 @@
               <w:listItem w:displayText="Desejável" w:value="Desejável"/>
             </w:comboBox>
           </w:sdtPr>
+          <w:sdtEndPr/>
           <w:sdtContent>
             <w:tc>
               <w:tcPr>
@@ -10730,6 +10791,7 @@
               <w:listItem w:displayText="Usabilidade" w:value="Usabilidade"/>
             </w:comboBox>
           </w:sdtPr>
+          <w:sdtEndPr/>
           <w:sdtContent>
             <w:tc>
               <w:tcPr>
@@ -10774,6 +10836,7 @@
               <w:listItem w:displayText="Desejável" w:value="Desejável"/>
             </w:comboBox>
           </w:sdtPr>
+          <w:sdtEndPr/>
           <w:sdtContent>
             <w:tc>
               <w:tcPr>
@@ -10913,6 +10976,7 @@
               <w:listItem w:displayText="Usabilidade" w:value="Usabilidade"/>
             </w:comboBox>
           </w:sdtPr>
+          <w:sdtEndPr/>
           <w:sdtContent>
             <w:tc>
               <w:tcPr>
@@ -10957,6 +11021,7 @@
               <w:listItem w:displayText="Desejável" w:value="Desejável"/>
             </w:comboBox>
           </w:sdtPr>
+          <w:sdtEndPr/>
           <w:sdtContent>
             <w:tc>
               <w:tcPr>
@@ -11096,6 +11161,7 @@
               <w:listItem w:displayText="Usabilidade" w:value="Usabilidade"/>
             </w:comboBox>
           </w:sdtPr>
+          <w:sdtEndPr/>
           <w:sdtContent>
             <w:tc>
               <w:tcPr>
@@ -11140,6 +11206,7 @@
               <w:listItem w:displayText="Desejável" w:value="Desejável"/>
             </w:comboBox>
           </w:sdtPr>
+          <w:sdtEndPr/>
           <w:sdtContent>
             <w:tc>
               <w:tcPr>
@@ -11279,6 +11346,7 @@
               <w:listItem w:displayText="Usabilidade" w:value="Usabilidade"/>
             </w:comboBox>
           </w:sdtPr>
+          <w:sdtEndPr/>
           <w:sdtContent>
             <w:tc>
               <w:tcPr>
@@ -11323,6 +11391,7 @@
               <w:listItem w:displayText="Desejável" w:value="Desejável"/>
             </w:comboBox>
           </w:sdtPr>
+          <w:sdtEndPr/>
           <w:sdtContent>
             <w:tc>
               <w:tcPr>
@@ -11462,6 +11531,7 @@
               <w:listItem w:displayText="Usabilidade" w:value="Usabilidade"/>
             </w:comboBox>
           </w:sdtPr>
+          <w:sdtEndPr/>
           <w:sdtContent>
             <w:tc>
               <w:tcPr>
@@ -11506,6 +11576,7 @@
               <w:listItem w:displayText="Desejável" w:value="Desejável"/>
             </w:comboBox>
           </w:sdtPr>
+          <w:sdtEndPr/>
           <w:sdtContent>
             <w:tc>
               <w:tcPr>
@@ -12048,6 +12119,7 @@
               <w:listItem w:displayText="Usabilidade" w:value="Usabilidade"/>
             </w:comboBox>
           </w:sdtPr>
+          <w:sdtEndPr/>
           <w:sdtContent>
             <w:tc>
               <w:tcPr>
@@ -12092,6 +12164,7 @@
               <w:listItem w:displayText="Desejável" w:value="Desejável"/>
             </w:comboBox>
           </w:sdtPr>
+          <w:sdtEndPr/>
           <w:sdtContent>
             <w:tc>
               <w:tcPr>
@@ -12231,6 +12304,7 @@
               <w:listItem w:displayText="Usabilidade" w:value="Usabilidade"/>
             </w:comboBox>
           </w:sdtPr>
+          <w:sdtEndPr/>
           <w:sdtContent>
             <w:tc>
               <w:tcPr>
@@ -12275,6 +12349,7 @@
               <w:listItem w:displayText="Desejável" w:value="Desejável"/>
             </w:comboBox>
           </w:sdtPr>
+          <w:sdtEndPr/>
           <w:sdtContent>
             <w:tc>
               <w:tcPr>
@@ -12414,6 +12489,7 @@
               <w:listItem w:displayText="Usabilidade" w:value="Usabilidade"/>
             </w:comboBox>
           </w:sdtPr>
+          <w:sdtEndPr/>
           <w:sdtContent>
             <w:tc>
               <w:tcPr>
@@ -12458,6 +12534,7 @@
               <w:listItem w:displayText="Desejável" w:value="Desejável"/>
             </w:comboBox>
           </w:sdtPr>
+          <w:sdtEndPr/>
           <w:sdtContent>
             <w:tc>
               <w:tcPr>
@@ -12597,6 +12674,7 @@
               <w:listItem w:displayText="Usabilidade" w:value="Usabilidade"/>
             </w:comboBox>
           </w:sdtPr>
+          <w:sdtEndPr/>
           <w:sdtContent>
             <w:tc>
               <w:tcPr>
@@ -12641,6 +12719,7 @@
               <w:listItem w:displayText="Desejável" w:value="Desejável"/>
             </w:comboBox>
           </w:sdtPr>
+          <w:sdtEndPr/>
           <w:sdtContent>
             <w:tc>
               <w:tcPr>
@@ -12780,6 +12859,7 @@
               <w:listItem w:displayText="Usabilidade" w:value="Usabilidade"/>
             </w:comboBox>
           </w:sdtPr>
+          <w:sdtEndPr/>
           <w:sdtContent>
             <w:tc>
               <w:tcPr>
@@ -12824,6 +12904,7 @@
               <w:listItem w:displayText="Desejável" w:value="Desejável"/>
             </w:comboBox>
           </w:sdtPr>
+          <w:sdtEndPr/>
           <w:sdtContent>
             <w:tc>
               <w:tcPr>
@@ -13366,6 +13447,7 @@
               <w:listItem w:displayText="Usabilidade" w:value="Usabilidade"/>
             </w:comboBox>
           </w:sdtPr>
+          <w:sdtEndPr/>
           <w:sdtContent>
             <w:tc>
               <w:tcPr>
@@ -13410,6 +13492,7 @@
               <w:listItem w:displayText="Desejável" w:value="Desejável"/>
             </w:comboBox>
           </w:sdtPr>
+          <w:sdtEndPr/>
           <w:sdtContent>
             <w:tc>
               <w:tcPr>
@@ -13549,6 +13632,7 @@
               <w:listItem w:displayText="Usabilidade" w:value="Usabilidade"/>
             </w:comboBox>
           </w:sdtPr>
+          <w:sdtEndPr/>
           <w:sdtContent>
             <w:tc>
               <w:tcPr>
@@ -13593,6 +13677,7 @@
               <w:listItem w:displayText="Desejável" w:value="Desejável"/>
             </w:comboBox>
           </w:sdtPr>
+          <w:sdtEndPr/>
           <w:sdtContent>
             <w:tc>
               <w:tcPr>
@@ -13732,6 +13817,7 @@
               <w:listItem w:displayText="Usabilidade" w:value="Usabilidade"/>
             </w:comboBox>
           </w:sdtPr>
+          <w:sdtEndPr/>
           <w:sdtContent>
             <w:tc>
               <w:tcPr>
@@ -13776,6 +13862,7 @@
               <w:listItem w:displayText="Desejável" w:value="Desejável"/>
             </w:comboBox>
           </w:sdtPr>
+          <w:sdtEndPr/>
           <w:sdtContent>
             <w:tc>
               <w:tcPr>
@@ -13915,6 +14002,7 @@
               <w:listItem w:displayText="Usabilidade" w:value="Usabilidade"/>
             </w:comboBox>
           </w:sdtPr>
+          <w:sdtEndPr/>
           <w:sdtContent>
             <w:tc>
               <w:tcPr>
@@ -13959,6 +14047,7 @@
               <w:listItem w:displayText="Desejável" w:value="Desejável"/>
             </w:comboBox>
           </w:sdtPr>
+          <w:sdtEndPr/>
           <w:sdtContent>
             <w:tc>
               <w:tcPr>
@@ -14098,6 +14187,7 @@
               <w:listItem w:displayText="Usabilidade" w:value="Usabilidade"/>
             </w:comboBox>
           </w:sdtPr>
+          <w:sdtEndPr/>
           <w:sdtContent>
             <w:tc>
               <w:tcPr>
@@ -14142,6 +14232,7 @@
               <w:listItem w:displayText="Desejável" w:value="Desejável"/>
             </w:comboBox>
           </w:sdtPr>
+          <w:sdtEndPr/>
           <w:sdtContent>
             <w:tc>
               <w:tcPr>
@@ -14408,13 +14499,7 @@
               </w:rPr>
             </w:pPr>
             <w:r>
-              <w:t>Usabilidade e Design</w:t>
-            </w:r>
-            <w:r>
-              <w:t xml:space="preserve">: </w:t>
-            </w:r>
-            <w:r>
-              <w:t>A interface deve seguir uma identidade visual minimalista e de alto contraste, com paleta focada em preto, branco e destaques em tons de roxo garantindo conforto visual e legibilidade mesmo em ambientes agitados.</w:t>
+              <w:t>Usabilidade e Design: A interface deve seguir uma identidade visual minimalista e de alto contraste, com paleta focada em preto, branco e destaques em tons de roxo garantindo conforto visual e legibilidade mesmo em ambientes agitados.</w:t>
             </w:r>
           </w:p>
         </w:tc>
@@ -14447,6 +14532,7 @@
               <w:listItem w:displayText="Usabilidade" w:value="Usabilidade"/>
             </w:comboBox>
           </w:sdtPr>
+          <w:sdtEndPr/>
           <w:sdtContent>
             <w:tc>
               <w:tcPr>
@@ -14490,6 +14576,7 @@
               <w:listItem w:displayText="Desejável" w:value="Desejável"/>
             </w:comboBox>
           </w:sdtPr>
+          <w:sdtEndPr/>
           <w:sdtContent>
             <w:tc>
               <w:tcPr>
@@ -14566,13 +14653,7 @@
               </w:rPr>
             </w:pPr>
             <w:r>
-              <w:t>Disponibilidade</w:t>
-            </w:r>
-            <w:r>
-              <w:t xml:space="preserve">: </w:t>
-            </w:r>
-            <w:r>
-              <w:t>O aplicativo deve armazenar os dados localmente para que o usuário possa consultar e adicionar receitas mesmo sem conexão com a internet.</w:t>
+              <w:t>Disponibilidade: O aplicativo deve armazenar os dados localmente para que o usuário possa consultar e adicionar receitas mesmo sem conexão com a internet.</w:t>
             </w:r>
           </w:p>
         </w:tc>
@@ -14605,6 +14686,7 @@
               <w:listItem w:displayText="Usabilidade" w:value="Usabilidade"/>
             </w:comboBox>
           </w:sdtPr>
+          <w:sdtEndPr/>
           <w:sdtContent>
             <w:tc>
               <w:tcPr>
@@ -14648,6 +14730,7 @@
               <w:listItem w:displayText="Desejável" w:value="Desejável"/>
             </w:comboBox>
           </w:sdtPr>
+          <w:sdtEndPr/>
           <w:sdtContent>
             <w:tc>
               <w:tcPr>
@@ -14724,13 +14807,7 @@
               </w:rPr>
             </w:pPr>
             <w:r>
-              <w:t>Desempenho</w:t>
-            </w:r>
-            <w:r>
-              <w:t xml:space="preserve">: </w:t>
-            </w:r>
-            <w:r>
-              <w:t>O carregamento da lista do repositório principal e a abertura dos detalhes de uma receita devem ocorrer em menos de 2 segundos.</w:t>
+              <w:t>Desempenho: O carregamento da lista do repositório principal e a abertura dos detalhes de uma receita devem ocorrer em menos de 2 segundos.</w:t>
             </w:r>
           </w:p>
         </w:tc>
@@ -14763,6 +14840,7 @@
               <w:listItem w:displayText="Usabilidade" w:value="Usabilidade"/>
             </w:comboBox>
           </w:sdtPr>
+          <w:sdtEndPr/>
           <w:sdtContent>
             <w:tc>
               <w:tcPr>
@@ -14806,6 +14884,7 @@
               <w:listItem w:displayText="Desejável" w:value="Desejável"/>
             </w:comboBox>
           </w:sdtPr>
+          <w:sdtEndPr/>
           <w:sdtContent>
             <w:tc>
               <w:tcPr>
@@ -14882,13 +14961,7 @@
               </w:rPr>
             </w:pPr>
             <w:r>
-              <w:t>Portabilidade</w:t>
-            </w:r>
-            <w:r>
-              <w:t xml:space="preserve">: </w:t>
-            </w:r>
-            <w:r>
-              <w:t xml:space="preserve">O aplicativo deve ser desenvolvido utilizando uma tecnologia </w:t>
+              <w:t xml:space="preserve">Portabilidade: O aplicativo deve ser desenvolvido utilizando uma tecnologia </w:t>
             </w:r>
             <w:proofErr w:type="spellStart"/>
             <w:r>
@@ -14937,6 +15010,7 @@
               <w:listItem w:displayText="Usabilidade" w:value="Usabilidade"/>
             </w:comboBox>
           </w:sdtPr>
+          <w:sdtEndPr/>
           <w:sdtContent>
             <w:tc>
               <w:tcPr>
@@ -14980,6 +15054,7 @@
               <w:listItem w:displayText="Desejável" w:value="Desejável"/>
             </w:comboBox>
           </w:sdtPr>
+          <w:sdtEndPr/>
           <w:sdtContent>
             <w:tc>
               <w:tcPr>
@@ -15056,13 +15131,7 @@
               </w:rPr>
             </w:pPr>
             <w:r>
-              <w:t>Segurança e Integridade:</w:t>
-            </w:r>
-            <w:r>
-              <w:t xml:space="preserve"> </w:t>
-            </w:r>
-            <w:r>
-              <w:t>O aplicativo deve garantir que as fotos anexadas sejam comprimidas antes de serem salvas no dispositivo, evitando o consumo excessivo do armazenamento local do usuário.</w:t>
+              <w:t>Segurança e Integridade: O aplicativo deve garantir que as fotos anexadas sejam comprimidas antes de serem salvas no dispositivo, evitando o consumo excessivo do armazenamento local do usuário.</w:t>
             </w:r>
           </w:p>
         </w:tc>
@@ -15095,6 +15164,7 @@
               <w:listItem w:displayText="Usabilidade" w:value="Usabilidade"/>
             </w:comboBox>
           </w:sdtPr>
+          <w:sdtEndPr/>
           <w:sdtContent>
             <w:tc>
               <w:tcPr>
@@ -15138,6 +15208,7 @@
               <w:listItem w:displayText="Desejável" w:value="Desejável"/>
             </w:comboBox>
           </w:sdtPr>
+          <w:sdtEndPr/>
           <w:sdtContent>
             <w:tc>
               <w:tcPr>
@@ -15245,6 +15316,7 @@
               <w:listItem w:displayText="Usabilidade" w:value="Usabilidade"/>
             </w:comboBox>
           </w:sdtPr>
+          <w:sdtEndPr/>
           <w:sdtContent>
             <w:tc>
               <w:tcPr>
@@ -15289,6 +15361,7 @@
               <w:listItem w:displayText="Desejável" w:value="Desejável"/>
             </w:comboBox>
           </w:sdtPr>
+          <w:sdtEndPr/>
           <w:sdtContent>
             <w:tc>
               <w:tcPr>
@@ -15395,6 +15468,7 @@
               <w:listItem w:displayText="Usabilidade" w:value="Usabilidade"/>
             </w:comboBox>
           </w:sdtPr>
+          <w:sdtEndPr/>
           <w:sdtContent>
             <w:tc>
               <w:tcPr>
@@ -15439,6 +15513,7 @@
               <w:listItem w:displayText="Desejável" w:value="Desejável"/>
             </w:comboBox>
           </w:sdtPr>
+          <w:sdtEndPr/>
           <w:sdtContent>
             <w:tc>
               <w:tcPr>
@@ -15616,7 +15691,7 @@
         <w:sz w:val="16"/>
         <w:szCs w:val="16"/>
       </w:rPr>
-      <w:t>4</w:t>
+      <w:t>3</w:t>
     </w:r>
     <w:r>
       <w:rPr>
@@ -20433,6 +20508,7 @@
   </w:compat>
   <w:rsids>
     <w:rsidRoot w:val="005D2434"/>
+    <w:rsid w:val="00034A57"/>
     <w:rsid w:val="00047AE3"/>
     <w:rsid w:val="00066164"/>
     <w:rsid w:val="000736F6"/>
@@ -22291,6 +22367,12 @@
 </file>
 
 <file path=customXml/item1.xml><?xml version="1.0" encoding="utf-8"?>
+<p:properties xmlns:p="http://schemas.microsoft.com/office/2006/metadata/properties" xmlns:xsi="http://www.w3.org/2001/XMLSchema-instance" xmlns:pc="http://schemas.microsoft.com/office/infopath/2007/PartnerControls">
+  <documentManagement/>
+</p:properties>
+</file>
+
+<file path=customXml/item2.xml><?xml version="1.0" encoding="utf-8"?>
 <ct:contentTypeSchema xmlns:ct="http://schemas.microsoft.com/office/2006/metadata/contentType" xmlns:ma="http://schemas.microsoft.com/office/2006/metadata/properties/metaAttributes" ct:_="" ma:_="" ma:contentTypeName="Documento" ma:contentTypeID="0x01010078A2D2C2733B7342A34F941B973AA6E6" ma:contentTypeVersion="3" ma:contentTypeDescription="Crie um novo documento." ma:contentTypeScope="" ma:versionID="81fa379c16276b21aa95b0bba487e0d8">
   <xsd:schema xmlns:xsd="http://www.w3.org/2001/XMLSchema" xmlns:xs="http://www.w3.org/2001/XMLSchema" xmlns:p="http://schemas.microsoft.com/office/2006/metadata/properties" xmlns:ns2="f534e9f2-b7ec-4ccc-a69c-51d3e3635b48" targetNamespace="http://schemas.microsoft.com/office/2006/metadata/properties" ma:root="true" ma:fieldsID="723e5ea99451f57ad090176ed3370c4a" ns2:_="">
     <xsd:import namespace="f534e9f2-b7ec-4ccc-a69c-51d3e3635b48"/>
@@ -22428,12 +22510,6 @@
 </ct:contentTypeSchema>
 </file>
 
-<file path=customXml/item2.xml><?xml version="1.0" encoding="utf-8"?>
-<p:properties xmlns:p="http://schemas.microsoft.com/office/2006/metadata/properties" xmlns:xsi="http://www.w3.org/2001/XMLSchema-instance" xmlns:pc="http://schemas.microsoft.com/office/infopath/2007/PartnerControls">
-  <documentManagement/>
-</p:properties>
-</file>
-
 <file path=customXml/item3.xml><?xml version="1.0" encoding="utf-8"?>
 <?mso-contentType ?>
 <FormTemplates xmlns="http://schemas.microsoft.com/sharepoint/v3/contenttype/forms">
@@ -22448,6 +22524,15 @@
 </file>
 
 <file path=customXml/itemProps1.xml><?xml version="1.0" encoding="utf-8"?>
+<ds:datastoreItem xmlns:ds="http://schemas.openxmlformats.org/officeDocument/2006/customXml" ds:itemID="{B5B0094D-6F90-418A-A6D3-E51A5C5AB460}">
+  <ds:schemaRefs>
+    <ds:schemaRef ds:uri="http://schemas.microsoft.com/office/2006/metadata/properties"/>
+    <ds:schemaRef ds:uri="http://schemas.microsoft.com/office/infopath/2007/PartnerControls"/>
+  </ds:schemaRefs>
+</ds:datastoreItem>
+</file>
+
+<file path=customXml/itemProps2.xml><?xml version="1.0" encoding="utf-8"?>
 <ds:datastoreItem xmlns:ds="http://schemas.openxmlformats.org/officeDocument/2006/customXml" ds:itemID="{208364F8-A116-49D3-9F60-C5F1C6ED0265}">
   <ds:schemaRefs>
     <ds:schemaRef ds:uri="http://schemas.microsoft.com/office/2006/metadata/contentType"/>
@@ -22465,15 +22550,6 @@
 </ds:datastoreItem>
 </file>
 
-<file path=customXml/itemProps2.xml><?xml version="1.0" encoding="utf-8"?>
-<ds:datastoreItem xmlns:ds="http://schemas.openxmlformats.org/officeDocument/2006/customXml" ds:itemID="{B5B0094D-6F90-418A-A6D3-E51A5C5AB460}">
-  <ds:schemaRefs>
-    <ds:schemaRef ds:uri="http://schemas.microsoft.com/office/2006/metadata/properties"/>
-    <ds:schemaRef ds:uri="http://schemas.microsoft.com/office/infopath/2007/PartnerControls"/>
-  </ds:schemaRefs>
-</ds:datastoreItem>
-</file>
-
 <file path=customXml/itemProps3.xml><?xml version="1.0" encoding="utf-8"?>
 <ds:datastoreItem xmlns:ds="http://schemas.openxmlformats.org/officeDocument/2006/customXml" ds:itemID="{32D32157-1200-47DA-9A54-008E7A271811}">
   <ds:schemaRefs>
@@ -22483,7 +22559,7 @@
 </file>
 
 <file path=customXml/itemProps4.xml><?xml version="1.0" encoding="utf-8"?>
-<ds:datastoreItem xmlns:ds="http://schemas.openxmlformats.org/officeDocument/2006/customXml" ds:itemID="{AF4CB528-28DC-429A-AB02-FFBEF770FDCD}">
+<ds:datastoreItem xmlns:ds="http://schemas.openxmlformats.org/officeDocument/2006/customXml" ds:itemID="{236F59BD-9CFB-436F-B189-46CA934EEA67}">
   <ds:schemaRefs>
     <ds:schemaRef ds:uri="http://schemas.openxmlformats.org/officeDocument/2006/bibliography"/>
   </ds:schemaRefs>

</xml_diff>